<commit_message>
Corrige layout final do relatório
</commit_message>
<xml_diff>
--- a/docs/relatorio_final_unificado.docx
+++ b/docs/relatorio_final_unificado.docx
@@ -69,7 +69,7 @@
     </w:p>
     <w:p>
       <w:pPr>
-        <w:spacing w:after="2200"/>
+        <w:spacing w:after="1400"/>
       </w:pPr>
     </w:p>
     <w:p>
@@ -89,9 +89,16 @@
       </w:r>
     </w:p>
     <w:p>
-      <w:r>
-        <w:br w:type="page"/>
-      </w:r>
+      <w:pPr>
+        <w:sectPr>
+          <w:headerReference w:type="default" r:id="rId9"/>
+          <w:footerReference w:type="default" r:id="rId10"/>
+          <w:pgSz w:w="12240" w:h="15840"/>
+          <w:pgMar w:top="1440" w:right="1440" w:bottom="1440" w:left="1440" w:header="708" w:footer="708" w:gutter="0"/>
+          <w:cols w:space="720"/>
+          <w:docGrid w:linePitch="360"/>
+        </w:sectPr>
+      </w:pPr>
     </w:p>
     <w:p>
       <w:pPr>
@@ -144,7 +151,7 @@
       <w:r>
         <w:drawing>
           <wp:inline xmlns:a="http://schemas.openxmlformats.org/drawingml/2006/main" xmlns:pic="http://schemas.openxmlformats.org/drawingml/2006/picture">
-            <wp:extent cx="5257800" cy="2037985"/>
+            <wp:extent cx="4297680" cy="1665830"/>
             <wp:docPr id="1" name="Picture 1" descr="Gráfico horizontal com F1 macro, ROUGE-1, Precision@1, Hit@4 e faithfulness."/>
             <wp:cNvGraphicFramePr>
               <a:graphicFrameLocks noChangeAspect="1"/>
@@ -165,7 +172,7 @@
                   <pic:spPr>
                     <a:xfrm>
                       <a:off x="0" y="0"/>
-                      <a:ext cx="5257800" cy="2037985"/>
+                      <a:ext cx="4297680" cy="1665830"/>
                     </a:xfrm>
                     <a:prstGeom prst="rect"/>
                   </pic:spPr>
@@ -711,7 +718,26 @@
     </w:p>
     <w:p>
       <w:pPr>
+        <w:spacing w:before="0" w:after="0" w:lineRule="exact" w:line="20"/>
+        <w:sectPr>
+          <w:type w:val="nextPage"/>
+          <w:pgSz w:w="12240" w:h="15840"/>
+          <w:pgMar w:top="1440" w:right="1440" w:bottom="1440" w:left="1440" w:header="708" w:footer="708" w:gutter="0"/>
+          <w:cols w:space="720"/>
+          <w:docGrid w:linePitch="360"/>
+        </w:sectPr>
+      </w:pPr>
+      <w:r>
+        <w:rPr>
+          <w:sz w:val="2"/>
+        </w:rPr>
+        <w:t xml:space="preserve"> </w:t>
+      </w:r>
+    </w:p>
+    <w:p>
+      <w:pPr>
         <w:pStyle w:val="Heading2"/>
+        <w:spacing w:before="480"/>
       </w:pPr>
       <w:r>
         <w:t>Campos de origem</w:t>
@@ -725,6 +751,7 @@
     <w:p>
       <w:pPr>
         <w:pStyle w:val="Heading1"/>
+        <w:spacing w:before="80"/>
       </w:pPr>
       <w:r>
         <w:t>2. Sprint 3 — geração de linguagem natural</w:t>
@@ -2452,6 +2479,7 @@
     <w:p>
       <w:pPr>
         <w:pStyle w:val="Heading2"/>
+        <w:pageBreakBefore/>
       </w:pPr>
       <w:r>
         <w:t>Retriever e re-ranking</w:t>
@@ -5156,8 +5184,6 @@
       </w:r>
     </w:p>
     <w:sectPr>
-      <w:headerReference w:type="default" r:id="rId9"/>
-      <w:footerReference w:type="default" r:id="rId10"/>
       <w:pgSz w:w="12240" w:h="15840"/>
       <w:pgMar w:top="1440" w:right="1440" w:bottom="1440" w:left="1440" w:header="708" w:footer="708" w:gutter="0"/>
       <w:cols w:space="720"/>
@@ -5184,7 +5210,19 @@
       <w:t xml:space="preserve">Prova de conceito sintética  |  Página </w:t>
     </w:r>
     <w:r>
-      <w:fldSimple w:instr="PAGE"/>
+      <w:fldChar w:fldCharType="begin"/>
+    </w:r>
+    <w:r>
+      <w:instrText xml:space="preserve"> PAGE </w:instrText>
+    </w:r>
+    <w:r>
+      <w:fldChar w:fldCharType="separate"/>
+    </w:r>
+    <w:r>
+      <w:t>1</w:t>
+    </w:r>
+    <w:r>
+      <w:fldChar w:fldCharType="end"/>
     </w:r>
   </w:p>
 </w:ftr>

</xml_diff>